<commit_message>
feat(spps): implement uniform-frequency flyback architecture and standalone subsystem table
- Convert Stage 3 isolated DC-DC converter to uniform-frequency PWM (UC3843 / UCC28C43 @ 65 kHz)
- Replace active synchronous rectification with MBR10100 Schottky diode with heatsink
- Add standalone copy-paste ready DOCX table for Stage 3 subsystem (STAGE_3_FLYBACK_SUBSYSTEM_TABLE.docx)
- Update and regenerate all block diagrams (PNG, SVG, DOT) and Mermaid diagrams
- Align PRD (.docx and .md), HDD, architecture dossiers, and bring-up checklists
</commit_message>
<xml_diff>
--- a/STAGE_3_FLYBACK_SUBSYSTEM_TABLE.docx
+++ b/STAGE_3_FLYBACK_SUBSYSTEM_TABLE.docx
@@ -13,7 +13,7 @@
           <w:color w:val="1A365D"/>
           <w:sz w:val="28"/>
         </w:rPr>
-        <w:t>Stage 3: Converter DC-DC (Isolated Flyback) Subsystem</w:t>
+        <w:t>Stage 3: Converter DC-DC (Uniform-Frequency Isolated Flyback) Subsystem</w:t>
       </w:r>
     </w:p>
     <w:p>
@@ -382,7 +382,7 @@
                 <w:color w:val="1A202C"/>
                 <w:sz w:val="17"/>
               </w:rPr>
-              <w:t>Quasi-Resonant Controller</w:t>
+              <w:t>Uniform-Freq PWM Controller</w:t>
             </w:r>
           </w:p>
         </w:tc>
@@ -440,7 +440,7 @@
                 <w:color w:val="1A202C"/>
                 <w:sz w:val="17"/>
               </w:rPr>
-              <w:t>Texas Instruments UCC28740DR (SOIC-7)</w:t>
+              <w:t>Texas Instruments UC3843 / UCC28C43 (SOIC-8 / DIP-8)</w:t>
             </w:r>
           </w:p>
         </w:tc>
@@ -469,7 +469,7 @@
                 <w:color w:val="1A202C"/>
                 <w:sz w:val="17"/>
               </w:rPr>
-              <w:t>Valley-switching detector, aux ZCD, optical FB pin, cycle-by-cycle CS</w:t>
+              <w:t>Uniform 65 kHz clock, RT/CT oscillator, cycle-by-cycle CS, direct totem-pole gate out</w:t>
             </w:r>
           </w:p>
         </w:tc>
@@ -498,7 +498,7 @@
                 <w:color w:val="1A202C"/>
                 <w:sz w:val="17"/>
               </w:rPr>
-              <w:t>Modulates switching frequency (up to 80 kHz) to turn on primary MOSFET at drain voltage resonance minimums, slashing turn-on capacitive losses by &gt; 60%.</w:t>
+              <w:t>Generates constant-frequency PWM switching pulses at a uniform 65 kHz rate, providing predictable EMI harmonics and deterministic current-mode control.</w:t>
             </w:r>
           </w:p>
         </w:tc>
@@ -532,7 +532,7 @@
                 <w:color w:val="1A202C"/>
                 <w:sz w:val="17"/>
               </w:rPr>
-              <w:t>Primary Power Switch</w:t>
+              <w:t>Oscillator Timing Network</w:t>
             </w:r>
           </w:p>
         </w:tc>
@@ -561,7 +561,9 @@
                 <w:color w:val="1A202C"/>
                 <w:sz w:val="17"/>
               </w:rPr>
-              <w:t>Q1</w:t>
+              <w:t>R_T</w:t>
+              <w:br/>
+              <w:t>C_T</w:t>
             </w:r>
           </w:p>
         </w:tc>
@@ -590,7 +592,9 @@
                 <w:color w:val="1A202C"/>
                 <w:sz w:val="17"/>
               </w:rPr>
-              <w:t>Infineon IPB80R290P7 (CoolMOS P7, D2PAK)</w:t>
+              <w:t>Precision Thin-Film Resistor +</w:t>
+              <w:br/>
+              <w:t>C0G/NP0 Ceramic Capacitor</w:t>
             </w:r>
           </w:p>
         </w:tc>
@@ -619,7 +623,9 @@
                 <w:color w:val="1A202C"/>
                 <w:sz w:val="17"/>
               </w:rPr>
-              <w:t>800 V, 17 A, R_DS(on) = 0.29 Ω, V_DS,peak = 599 V</w:t>
+              <w:t>R_T = 10.0 kΩ (1%),</w:t>
+              <w:br/>
+              <w:t>C_T = 2.2 nF (50V C0G)</w:t>
             </w:r>
           </w:p>
         </w:tc>
@@ -648,7 +654,7 @@
                 <w:color w:val="1A202C"/>
                 <w:sz w:val="17"/>
               </w:rPr>
-              <w:t>Low-loss primary switching element. Derated to 74.9% of breakdown voltage rating (strictly &lt; 75% limit). Conduction loss &lt;= 0.57 W.</w:t>
+              <w:t>Sets constant oscillator clock frequency: f_sw approx 1.72 / (R_T x C_T) = 65 kHz uniform clock without frequency jitter.</w:t>
             </w:r>
           </w:p>
         </w:tc>
@@ -682,7 +688,7 @@
                 <w:color w:val="1A202C"/>
                 <w:sz w:val="17"/>
               </w:rPr>
-              <w:t>Primary Current Sensing</w:t>
+              <w:t>Primary Power Switch</w:t>
             </w:r>
           </w:p>
         </w:tc>
@@ -711,7 +717,7 @@
                 <w:color w:val="1A202C"/>
                 <w:sz w:val="17"/>
               </w:rPr>
-              <w:t>R_CS</w:t>
+              <w:t>Q1</w:t>
             </w:r>
           </w:p>
         </w:tc>
@@ -740,7 +746,7 @@
                 <w:color w:val="1A202C"/>
                 <w:sz w:val="17"/>
               </w:rPr>
-              <w:t>Precision Sense Resistor Network</w:t>
+              <w:t>STMicroelectronics STP10NK80Z / Infineon IPB80R290P7</w:t>
             </w:r>
           </w:p>
         </w:tc>
@@ -769,7 +775,7 @@
                 <w:color w:val="1A202C"/>
                 <w:sz w:val="17"/>
               </w:rPr>
-              <w:t>Low-inductance metal foil, 0.25 Ω, 1%, 1 W</w:t>
+              <w:t>800 V, 17 A, R_DS(on) = 0.29 Ω, V_DS,peak = 599 V</w:t>
             </w:r>
           </w:p>
         </w:tc>
@@ -798,7 +804,7 @@
                 <w:color w:val="1A202C"/>
                 <w:sz w:val="17"/>
               </w:rPr>
-              <w:t>Senses primary switch peak current (I_pk = 2.96 A) on UCC28740 CS pin for cycle-by-cycle overcurrent protection (OCP).</w:t>
+              <w:t>Main switching element modulated by 65 kHz PWM gate drive. Voltage stress derated to 74.9% of 800V rating (&lt; 75% limit).</w:t>
             </w:r>
           </w:p>
         </w:tc>
@@ -832,7 +838,7 @@
                 <w:color w:val="1A202C"/>
                 <w:sz w:val="17"/>
               </w:rPr>
-              <w:t>RCD Snubber Clamp</w:t>
+              <w:t>Primary Current Sensing</w:t>
             </w:r>
           </w:p>
         </w:tc>
@@ -861,11 +867,7 @@
                 <w:color w:val="1A202C"/>
                 <w:sz w:val="17"/>
               </w:rPr>
-              <w:t>D_snub</w:t>
-              <w:br/>
-              <w:t>R_snub</w:t>
-              <w:br/>
-              <w:t>C_snub</w:t>
+              <w:t>R_CS</w:t>
             </w:r>
           </w:p>
         </w:tc>
@@ -894,11 +896,7 @@
                 <w:color w:val="1A202C"/>
                 <w:sz w:val="17"/>
               </w:rPr>
-              <w:t>Diodes Inc. US1M +</w:t>
-              <w:br/>
-              <w:t>3x 68 kΩ in parallel (22.6 kΩ, 3W) +</w:t>
-              <w:br/>
-              <w:t>1.0 nF / 1 kV Ceramic</w:t>
+              <w:t>Current Sense Shunt Resistor Network</w:t>
             </w:r>
           </w:p>
         </w:tc>
@@ -927,11 +925,7 @@
                 <w:color w:val="1A202C"/>
                 <w:sz w:val="17"/>
               </w:rPr>
-              <w:t>Diode: 1000 V, 1 A, t_rr = 75 ns;</w:t>
-              <w:br/>
-              <w:t>Cap: 1 nF / 1000 V ceramic;</w:t>
-              <w:br/>
-              <w:t>Clamp: ~216 V clamp level</w:t>
+              <w:t>Low-inductance metal strip, 0.25 Ω, 1%, 2 W</w:t>
             </w:r>
           </w:p>
         </w:tc>
@@ -960,7 +954,7 @@
                 <w:color w:val="1A202C"/>
                 <w:sz w:val="17"/>
               </w:rPr>
-              <w:t>Absorbs transformer primary leakage inductance energy (L_lk approx 2.2 uH); clamps peak drain-source voltage spike safely below 650 V peak.</w:t>
+              <w:t>Monitors primary switch peak current (I_pk = 2.96 A) on UC3843 ISENSE pin (Pin 3) with 1.0 V internal comparator threshold for cycle-by-cycle OCP.</w:t>
             </w:r>
           </w:p>
         </w:tc>
@@ -994,7 +988,7 @@
                 <w:color w:val="1A202C"/>
                 <w:sz w:val="17"/>
               </w:rPr>
-              <w:t>Flyback Power Transformer</w:t>
+              <w:t>RCD Snubber Clamp</w:t>
             </w:r>
           </w:p>
         </w:tc>
@@ -1023,7 +1017,11 @@
                 <w:color w:val="1A202C"/>
                 <w:sz w:val="17"/>
               </w:rPr>
-              <w:t>TX1</w:t>
+              <w:t>D_snub</w:t>
+              <w:br/>
+              <w:t>R_snub</w:t>
+              <w:br/>
+              <w:t>C_snub</w:t>
             </w:r>
           </w:p>
         </w:tc>
@@ -1052,7 +1050,11 @@
                 <w:color w:val="1A202C"/>
                 <w:sz w:val="17"/>
               </w:rPr>
-              <w:t>Ferroxcube PQ26/20 (3C95 Ferrite Core) / Custom</w:t>
+              <w:t>Diodes Inc. US1M +</w:t>
+              <w:br/>
+              <w:t>3x 68 kΩ in parallel (22.6 kΩ, 3W) +</w:t>
+              <w:br/>
+              <w:t>1.0 nF / 1 kV Ceramic</w:t>
             </w:r>
           </w:p>
         </w:tc>
@@ -1081,7 +1083,11 @@
                 <w:color w:val="1A202C"/>
                 <w:sz w:val="17"/>
               </w:rPr>
-              <w:t>L_p = 220 uH +/- 10%, B_max = 0.148 T (B_sat = 0.38 T), N_p = 36 T</w:t>
+              <w:t>Diode: 1000 V, 1 A, t_rr = 75 ns;</w:t>
+              <w:br/>
+              <w:t>Cap: 1 nF / 1000 V ceramic;</w:t>
+              <w:br/>
+              <w:t>Clamp: ~216 V clamp level</w:t>
             </w:r>
           </w:p>
         </w:tc>
@@ -1110,7 +1116,7 @@
                 <w:color w:val="1A202C"/>
                 <w:sz w:val="17"/>
               </w:rPr>
-              <w:t>Primary energy storage inductor (72 W throughput, I_pk = 2.96 A, low core loss, air gap l_g = 0.52 mm).</w:t>
+              <w:t>Damps high-voltage inductive kick caused by transformer leakage inductance (L_lk approx 2.2 uH); clamps peak drain voltage spike safely below 650 V peak.</w:t>
             </w:r>
           </w:p>
         </w:tc>
@@ -1144,7 +1150,7 @@
                 <w:color w:val="1A202C"/>
                 <w:sz w:val="17"/>
               </w:rPr>
-              <w:t>Auxiliary Bias &amp; Demag Winding</w:t>
+              <w:t>Flyback Power Transformer</w:t>
             </w:r>
           </w:p>
         </w:tc>
@@ -1173,7 +1179,7 @@
                 <w:color w:val="1A202C"/>
                 <w:sz w:val="17"/>
               </w:rPr>
-              <w:t>TX1_AUX</w:t>
+              <w:t>TX1</w:t>
             </w:r>
           </w:p>
         </w:tc>
@@ -1202,9 +1208,7 @@
                 <w:color w:val="1A202C"/>
                 <w:sz w:val="17"/>
               </w:rPr>
-              <w:t>N_aux = 4 T (0.25 mm wire) +</w:t>
-              <w:br/>
-              <w:t>Ultra-fast diode &amp; 10 uF MLCC</w:t>
+              <w:t>Ferroxcube PQ26/20 (3C95 Ferrite) / EE25 Core</w:t>
             </w:r>
           </w:p>
         </w:tc>
@@ -1233,7 +1237,7 @@
                 <w:color w:val="1A202C"/>
                 <w:sz w:val="17"/>
               </w:rPr>
-              <w:t>Output: +14.0 V DC bias rail</w:t>
+              <w:t>L_p = 220 uH +/- 10%, B_max = 0.148 T (B_sat = 0.38 T), N_p = 36 T</w:t>
             </w:r>
           </w:p>
         </w:tc>
@@ -1262,7 +1266,7 @@
                 <w:color w:val="1A202C"/>
                 <w:sz w:val="17"/>
               </w:rPr>
-              <w:t>Self-powers UCC28740 VCC pin after initial high-voltage startup and provides Zero Crossing Detection (ZCD) for core demagnetization timing.</w:t>
+              <w:t>Stores energy during switch on-time and delivers 72 W continuous power to secondary during off-time (Np:Ns = 6:1 turns ratio).</w:t>
             </w:r>
           </w:p>
         </w:tc>
@@ -1296,7 +1300,7 @@
                 <w:color w:val="1A202C"/>
                 <w:sz w:val="17"/>
               </w:rPr>
-              <w:t>Galvanic Safety Isolation Barrier</w:t>
+              <w:t>Auxiliary Bias Winding</w:t>
             </w:r>
           </w:p>
         </w:tc>
@@ -1325,7 +1329,7 @@
                 <w:color w:val="1A202C"/>
                 <w:sz w:val="17"/>
               </w:rPr>
-              <w:t>TX1_ISO</w:t>
+              <w:t>TX1_AUX</w:t>
             </w:r>
           </w:p>
         </w:tc>
@@ -1354,7 +1358,9 @@
                 <w:color w:val="1A202C"/>
                 <w:sz w:val="17"/>
               </w:rPr>
-              <w:t>Furukawa TEX-E Triple-Insulated Wire (TIW)</w:t>
+              <w:t>N_aux = 5 T (0.25 mm wire) +</w:t>
+              <w:br/>
+              <w:t>Fast Diode (UF4004) &amp; 47 µF Cap</w:t>
             </w:r>
           </w:p>
         </w:tc>
@@ -1383,7 +1389,7 @@
                 <w:color w:val="1A202C"/>
                 <w:sz w:val="17"/>
               </w:rPr>
-              <w:t>N_s = 6 T (N_p:N_s = 6:1), Reinforced insulation, &gt;= 6.4 mm creepage</w:t>
+              <w:t>Output: +14.0 V DC bias rail</w:t>
             </w:r>
           </w:p>
         </w:tc>
@@ -1412,7 +1418,7 @@
                 <w:color w:val="1A202C"/>
                 <w:sz w:val="17"/>
               </w:rPr>
-              <w:t>Conforms to IEC 62368-1 safety standards. Provides certified &gt;= 3000 V RMS dielectric withstand between primary hot and secondary touch-safe SELV domains.</w:t>
+              <w:t>Sustains UC3843 VCC pin (Pin 7) above UVLO threshold (8.4 V start / 7.6 V min) after initial high-voltage bleed startup.</w:t>
             </w:r>
           </w:p>
         </w:tc>
@@ -1446,7 +1452,7 @@
                 <w:color w:val="1A202C"/>
                 <w:sz w:val="17"/>
               </w:rPr>
-              <w:t>Smart Synchronous Rectifier Driver</w:t>
+              <w:t>Galvanic Safety Isolation Barrier</w:t>
             </w:r>
           </w:p>
         </w:tc>
@@ -1475,7 +1481,7 @@
                 <w:color w:val="1A202C"/>
                 <w:sz w:val="17"/>
               </w:rPr>
-              <w:t>U2</w:t>
+              <w:t>TX1_ISO</w:t>
             </w:r>
           </w:p>
         </w:tc>
@@ -1504,7 +1510,7 @@
                 <w:color w:val="1A202C"/>
                 <w:sz w:val="17"/>
               </w:rPr>
-              <w:t>Monolithic Power Systems MP6908GJ (TSOT23-6)</w:t>
+              <w:t>Furukawa TEX-E Triple-Insulated Wire (TIW)</w:t>
             </w:r>
           </w:p>
         </w:tc>
@@ -1533,7 +1539,7 @@
                 <w:color w:val="1A202C"/>
                 <w:sz w:val="17"/>
               </w:rPr>
-              <w:t>Fast turn-off (35 ns gate fall), V_DS drain-sense detection</w:t>
+              <w:t>N_s = 6 T (N_p:N_s = 6:1), Reinforced insulation, &gt;= 6.4 mm creepage</w:t>
             </w:r>
           </w:p>
         </w:tc>
@@ -1562,7 +1568,7 @@
                 <w:color w:val="1A202C"/>
                 <w:sz w:val="17"/>
               </w:rPr>
-              <w:t>Autonomous gate driver for secondary sync switch; eliminates external sync timing coils and prevents shoot-through during DCM/QR resonant ringing.</w:t>
+              <w:t>Complies with IEC 62368-1 standard. Provides certified &gt;= 3000 V RMS dielectric withstand between primary hot domain and secondary touch-safe SELV domain.</w:t>
             </w:r>
           </w:p>
         </w:tc>
@@ -1596,7 +1602,7 @@
                 <w:color w:val="1A202C"/>
                 <w:sz w:val="17"/>
               </w:rPr>
-              <w:t>Synchronous Rectifier Switch</w:t>
+              <w:t>Secondary Schottky Barrier Rectifier</w:t>
             </w:r>
           </w:p>
         </w:tc>
@@ -1625,7 +1631,7 @@
                 <w:color w:val="1A202C"/>
                 <w:sz w:val="17"/>
               </w:rPr>
-              <w:t>Q_SR</w:t>
+              <w:t>D_SEC</w:t>
             </w:r>
           </w:p>
         </w:tc>
@@ -1654,7 +1660,7 @@
                 <w:color w:val="1A202C"/>
                 <w:sz w:val="17"/>
               </w:rPr>
-              <w:t>Infineon BSC052N06NS (OptiMOS 5, SuperSO8)</w:t>
+              <w:t>ON Semi / Vishay MBR10100 / MBR20100CT</w:t>
             </w:r>
           </w:p>
         </w:tc>
@@ -1683,7 +1689,7 @@
                 <w:color w:val="1A202C"/>
                 <w:sz w:val="17"/>
               </w:rPr>
-              <w:t>60 V, R_DS(on) = 5.2 mΩ, I_RMS,sec = 7.61 A</w:t>
+              <w:t>100 V, 10 A Schottky Barrier Diode, V_F = 0.60 V, TO-220 with heatsink</w:t>
             </w:r>
           </w:p>
         </w:tc>
@@ -1712,7 +1718,7 @@
                 <w:color w:val="1A202C"/>
                 <w:sz w:val="17"/>
               </w:rPr>
-              <w:t>Replaces lossy Schottky diode (V_F = 0.6 V); cuts secondary rectification dissipation from 1.80 W to 0.42 W (saving 1.38 W continuous heat, heatsink-free).</w:t>
+              <w:t>Performs high-speed passive rectification of secondary flyback pulses. Highly reliable and robust passive design, eliminating active gate driver IC complexity.</w:t>
             </w:r>
           </w:p>
         </w:tc>
@@ -1806,9 +1812,9 @@
                 <w:color w:val="1A202C"/>
                 <w:sz w:val="17"/>
               </w:rPr>
-              <w:t>Panasonic OS-CON 470 uF / 35 V Polymer +</w:t>
+              <w:t>470 µF / 35 V Low-ESR Electrolytic +</w:t>
               <w:br/>
-              <w:t>2.2 uH Inductor + 22 uF MLCC</w:t>
+              <w:t>2.2 µH Inductor + 22 µF MLCC</w:t>
             </w:r>
           </w:p>
         </w:tc>
@@ -1837,7 +1843,7 @@
                 <w:color w:val="1A202C"/>
                 <w:sz w:val="17"/>
               </w:rPr>
-              <w:t>Ultra-low ESR (&lt; 15 mΩ), Delta V_ripple &lt; 50 mV pk-pk</w:t>
+              <w:t>Low-ESR filtering, Delta V_ripple &lt; 50 mV pk-pk</w:t>
             </w:r>
           </w:p>
         </w:tc>
@@ -1866,7 +1872,7 @@
                 <w:color w:val="1A202C"/>
                 <w:sz w:val="17"/>
               </w:rPr>
-              <w:t>Suppresses high-frequency 80 kHz switching pulses and secondary flyback current spikes to form clean intermediate DC rail.</w:t>
+              <w:t>Attenuates 65 kHz fundamental switching ripple and high-frequency commutation spikes to produce a quiet intermediate DC rail.</w:t>
             </w:r>
           </w:p>
         </w:tc>
@@ -1960,9 +1966,9 @@
                 <w:color w:val="1A202C"/>
                 <w:sz w:val="17"/>
               </w:rPr>
-              <w:t>Everlight EL817(S)(TA) Optocoupler +</w:t>
+              <w:t>Everlight PC817 / EL817 Optocoupler +</w:t>
               <w:br/>
-              <w:t>TI TL431AIDBZR Shunt Regulator</w:t>
+              <w:t>TI TL431 Shunt Regulator</w:t>
             </w:r>
           </w:p>
         </w:tc>
@@ -2020,7 +2026,7 @@
                 <w:color w:val="1A202C"/>
                 <w:sz w:val="17"/>
               </w:rPr>
-              <w:t>Secondary-side precision voltage divider senses the +24.0 V rail and transfers feedback error signal across isolation barrier to UCC28740 FB node.</w:t>
+              <w:t>Precision resistor divider samples +24.0 V rail, driving optocoupler LED to pull down UC3843 COMP pin (Pin 1), regulating rail to +/- 1.0%.</w:t>
             </w:r>
           </w:p>
         </w:tc>
@@ -2170,7 +2176,7 @@
                 <w:color w:val="1A202C"/>
                 <w:sz w:val="17"/>
               </w:rPr>
-              <w:t>Delivers stable intermediate regulated power to Stage 4 (Synchronous Buck-Boost Post-Regulator) and secondary auxiliary housekeeping LDOs.</w:t>
+              <w:t>Delivers stable intermediate regulated DC power to Stage 4 (Synchronous Buck-Boost Post-Regulator) and secondary auxiliary housekeeping LDOs.</w:t>
             </w:r>
           </w:p>
         </w:tc>

</xml_diff>